<commit_message>
Clarify why zeroing remains necessary (detection vs correction)
Add Introduction + Discussion framing (EN & JA): offsets zeroing corrects are
installation/time-dependent physics needing real-time in-situ correction, which
retrospective method-comparison statistics (BA regression, CCC) can detect but
not remove. Zeroing and regression/CCC operate at different layers and are
complementary; designing out offset sources removes the need to zero, leaving
gain and dynamic response as the residual design/validation problems.

References still 31/31, first-appearance order 1..31 verified in both docs.

Co-Authored-By: Tatsuki Onishi <bougtoir@gmail.com>
</commit_message>
<xml_diff>
--- a/zero_calibration_bpm/manuscripts/BPM_ZeroFree_Manuscript_EN.docx
+++ b/zero_calibration_bpm/manuscripts/BPM_ZeroFree_Manuscript_EN.docx
@@ -420,6 +420,58 @@
           <w:sz w:val="24"/>
         </w:rPr>
         <w:t>.</w:t>
+      </w:r>
+    </w:p>
+    <w:p>
+      <w:pPr>
+        <w:spacing w:after="120"/>
+      </w:pPr>
+      <w:r>
+        <w:rPr>
+          <w:rFonts w:ascii="Times New Roman" w:hAnsi="Times New Roman"/>
+          <w:b w:val="0"/>
+          <w:i w:val="0"/>
+          <w:sz w:val="24"/>
+        </w:rPr>
+        <w:t>Zeroing nevertheless remains indispensable at the bedside, because these offsets are installation- and time-dependent physics rather than a factory-fixable device defect. The hydrostatic column depends on the height of the transducer relative to the phlebostatic axis (about 7.5 mmHg per 10 cm) and changes whenever the patient or the transducer is repositioned</w:t>
+      </w:r>
+      <w:r>
+        <w:rPr>
+          <w:rFonts w:ascii="Times New Roman" w:hAnsi="Times New Roman"/>
+          <w:b w:val="0"/>
+          <w:i w:val="0"/>
+          <w:sz w:val="24"/>
+          <w:vertAlign w:val="superscript"/>
+        </w:rPr>
+        <w:t>3</w:t>
+      </w:r>
+      <w:r>
+        <w:rPr>
+          <w:rFonts w:ascii="Times New Roman" w:hAnsi="Times New Roman"/>
+          <w:b w:val="0"/>
+          <w:i w:val="0"/>
+          <w:sz w:val="24"/>
+        </w:rPr>
+        <w:t>; the atmospheric gauge reference drifts with weather and altitude; and electrical or thermal drift accumulates over time</w:t>
+      </w:r>
+      <w:r>
+        <w:rPr>
+          <w:rFonts w:ascii="Times New Roman" w:hAnsi="Times New Roman"/>
+          <w:b w:val="0"/>
+          <w:i w:val="0"/>
+          <w:sz w:val="24"/>
+          <w:vertAlign w:val="superscript"/>
+        </w:rPr>
+        <w:t>4–5</w:t>
+      </w:r>
+      <w:r>
+        <w:rPr>
+          <w:rFonts w:ascii="Times New Roman" w:hAnsi="Times New Roman"/>
+          <w:b w:val="0"/>
+          <w:i w:val="0"/>
+          <w:sz w:val="24"/>
+        </w:rPr>
+        <w:t>. Crucially, detection is not correction, and the two operate at different layers. Method-comparison analyses such as Bland–Altman regression are retrospective validation tools that require paired reference measurements, which are not available in real time for the patient in front of the clinician; zeroing is the only procedure that removes a known, setup-specific offset a priori and without a reference. Even when a regression reveals an offset, removing it still requires zeroing. Zeroing therefore corrects offset operationally, whereas regression and CCC decomposition detect residual gain and structure—and neither can substitute for the other.</w:t>
       </w:r>
     </w:p>
     <w:p>
@@ -1639,6 +1691,20 @@
           <w:color w:val="000000"/>
         </w:rPr>
         <w:t>4.3. Implications for sensor design</w:t>
+      </w:r>
+    </w:p>
+    <w:p>
+      <w:pPr>
+        <w:spacing w:after="120"/>
+      </w:pPr>
+      <w:r>
+        <w:rPr>
+          <w:rFonts w:ascii="Times New Roman" w:hAnsi="Times New Roman"/>
+          <w:b w:val="0"/>
+          <w:i w:val="0"/>
+          <w:sz w:val="24"/>
+        </w:rPr>
+        <w:t>The reason zeroing is still performed today is that it corrects a setup-specific offset in real time, a role that no retrospective method-comparison statistic can fill. This also points to the way forward: because zeroing addresses only the operational offset problem, designing the offset sources out of the hardware removes the need to zero at all, leaving gain and dynamic response as the residual design and validation problems.</w:t>
       </w:r>
     </w:p>
     <w:p>

</xml_diff>

<commit_message>
Replace unverifiable Atkinson-Nevill ref with verified Nickerson 1997
The cited 'Atkinson G, Nevill A. ... Biometrics 1997; 53: 775-777' could not be
found in Crossref, PubMed or OpenAlex (Biometrics 1997;53 CCC critique is by
Nickerson). Replace with the verified Nickerson 1997 note (DOI 10.2307/2533516),
which addresses CCC dependence on data variance/range, matching the citation
context. All 31 references now confirmed against authoritative sources.

Co-Authored-By: Tatsuki Onishi <bougtoir@gmail.com>
</commit_message>
<xml_diff>
--- a/zero_calibration_bpm/manuscripts/BPM_ZeroFree_Manuscript_EN.docx
+++ b/zero_calibration_bpm/manuscripts/BPM_ZeroFree_Manuscript_EN.docx
@@ -126,7 +126,7 @@
           <w:rFonts w:ascii="Times New Roman" w:hAnsi="Times New Roman"/>
           <w:sz w:val="24"/>
         </w:rPr>
-        <w:t>~3557</w:t>
+        <w:t>~3551</w:t>
       </w:r>
     </w:p>
     <w:p>
@@ -1905,7 +1905,7 @@
           <w:rFonts w:ascii="Times New Roman" w:hAnsi="Times New Roman"/>
           <w:sz w:val="20"/>
         </w:rPr>
-        <w:t>15. Atkinson G, Nevill A. Comment on the use of concordance correlation to assess the agreement between two variables. Biometrics 1997; 53: 775-777.</w:t>
+        <w:t>15. Nickerson CA. A note on “A concordance correlation coefficient to evaluate reproducibility”. Biometrics 1997; 53: 1503-1507.</w:t>
       </w:r>
     </w:p>
     <w:p>

</xml_diff>

<commit_message>
Align Introduction and Conclusion paragraph-by-paragraph
Restructure the English Introduction into five paragraphs, each mirrored 1:1
by a Conclusion paragraph, following the clinical/research-question flow:
(1) zeroing corrects offset not gain; (2) dynamic response is a second,
frequency-dependent gain error; (3) clinicians/manufacturers often misread the
minimal Bland-Altman summary, so regression/Deming/Passing-Bablok/CCC scale
shift are needed to use it correctly; (4) the same statistics underpin device
approval, motivating a compact reporting framework; (5) engineering offset
sources out of the hardware makes zeroing unnecessary, leaving gain and dynamic
response as the design/validation targets (v approx 1). Abstract updated to
match (248 words). Citation order (1-31) and all figure/table call-outs
unchanged.

Co-Authored-By: Tatsuki Onishi <bougtoir@gmail.com>
</commit_message>
<xml_diff>
--- a/zero_calibration_bpm/manuscripts/BPM_ZeroFree_Manuscript_EN.docx
+++ b/zero_calibration_bpm/manuscripts/BPM_ZeroFree_Manuscript_EN.docx
@@ -126,7 +126,7 @@
           <w:rFonts w:ascii="Times New Roman" w:hAnsi="Times New Roman"/>
           <w:sz w:val="24"/>
         </w:rPr>
-        <w:t>~3551</w:t>
+        <w:t>~3818</w:t>
       </w:r>
     </w:p>
     <w:p>
@@ -236,7 +236,7 @@
           <w:i w:val="0"/>
           <w:sz w:val="24"/>
         </w:rPr>
-        <w:t>Zero calibration of an invasive arterial pressure transducer removes the direct-current (DC) offset but not sensor-gain (scale) error. We examined which of the analyses commonly reported in device-validation studies actually detect a residual gain error after zeroing, and how a frequency-dependent dynamic-response error behaves.</w:t>
+        <w:t>Zero calibration of an invasive arterial pressure transducer removes the direct-current (DC) offset but not sensor-gain (scale) error. Because device validation and regulatory decisions often rest on the minimal Bland–Altman summary, we examined which reported analyses detect a residual gain error after zeroing, and how a dynamic-response error behaves.</w:t>
       </w:r>
     </w:p>
     <w:p>
@@ -264,7 +264,7 @@
           <w:i w:val="0"/>
           <w:sz w:val="24"/>
         </w:rPr>
-        <w:t>Using seeded simulations we generated paired device–reference systolic pressures (n = 150 per scenario) for four cases: offset only, ideal zeroing, uncompensated gain error, and a gain error masked by a compensating offset. Each case was assessed with the minimal Bland–Altman summary (mean bias, limits of agreement), Bland–Altman difference-versus-mean regression, Deming and Passing–Bablok regression, and Lin’s concordance correlation coefficient (CCC) with its scale-shift component. Synthetic arterial waveforms were passed through optimally-, under-, and over-damped second-order catheter–transducer models.</w:t>
+        <w:t>Using seeded simulations we generated paired device–reference systolic pressures (n = 150) for four cases: offset only, ideal zeroing, uncompensated gain error, and a gain error masked by a compensating offset. Each case was assessed with the minimal Bland–Altman summary (mean bias, limits of agreement), Bland–Altman difference-versus-mean regression, Deming and Passing–Bablok regression, and Lin’s concordance correlation coefficient (CCC) with its scale-shift component. Synthetic arterial waveforms were passed through optimally-, under-, and over-damped second-order catheter–transducer models.</w:t>
       </w:r>
     </w:p>
     <w:p>
@@ -292,7 +292,7 @@
           <w:i w:val="0"/>
           <w:sz w:val="24"/>
         </w:rPr>
-        <w:t>When a 10% gain error was masked by a compensating offset, the mean bias was +0.3 mmHg (apparently acceptable), yet the Bland–Altman regression slope (0.103), Deming slope (1.109), Passing–Bablok slope (1.111) and CCC scale shift (v = 1.108) all detected it. Underdamping inflated pulse pressure by 24% and overdamping attenuated it by 8%; these errors persist after zeroing and are diagnosed by the fast-flush test. CCC rose with the sampled pressure range for one fixed device (from 0.60 to 0.96).</w:t>
+        <w:t>When a 10% gain error was masked by a compensating offset, the mean bias was +0.3 mmHg (acceptable), yet the Bland–Altman regression slope (0.103), Deming slope (1.109), Passing–Bablok slope (1.111) and CCC scale shift (v = 1.108) all detected it. Underdamping inflated pulse pressure by 24% and overdamping attenuated it by 8%; these errors persist after zeroing and are diagnosed by the fast-flush test. CCC rose with the sampled range for one device (from 0.60 to 0.96).</w:t>
       </w:r>
     </w:p>
     <w:p>
@@ -320,7 +320,7 @@
           <w:i w:val="0"/>
           <w:sz w:val="24"/>
         </w:rPr>
-        <w:t>A mean-bias limits-of-agreement summary can miss a clinically relevant gain error; proportional-bias–aware analyses and an explicit dynamic-response check should be reported alongside it.</w:t>
+        <w:t>Read alone, a mean-bias limits-of-agreement summary can miss a clinically relevant gain error. Validation and device-approval reports should add a proportional-bias–aware analysis, the CCC decomposition with the sampled range, and a dynamic-response check, and define a design target (scale shift ≈ 1 without calibration) for self-calibrating sensors.</w:t>
       </w:r>
     </w:p>
     <w:p>
@@ -387,21 +387,7 @@
           <w:i w:val="0"/>
           <w:sz w:val="24"/>
         </w:rPr>
-        <w:t>.</w:t>
-      </w:r>
-    </w:p>
-    <w:p>
-      <w:pPr>
-        <w:spacing w:after="120"/>
-      </w:pPr>
-      <w:r>
-        <w:rPr>
-          <w:rFonts w:ascii="Times New Roman" w:hAnsi="Times New Roman"/>
-          <w:b w:val="0"/>
-          <w:i w:val="0"/>
-          <w:sz w:val="24"/>
-        </w:rPr>
-        <w:t>In a fluid-filled arterial line the external transducer is connected to the catheter tip by a saline column, which introduces direct-current (DC) offsets: the hydrostatic pressure difference between transducer and measurement site, the atmospheric reference of gauge pressure, and slow transducer drift</w:t>
+        <w:t>. In a fluid-filled line the external transducer is coupled to the catheter tip by a saline column, which introduces direct-current (DC) offsets: the hydrostatic pressure difference between transducer and measurement site, the atmospheric reference of gauge pressure, and slow transducer drift</w:t>
       </w:r>
       <w:r>
         <w:rPr>
@@ -419,7 +405,7 @@
           <w:i w:val="0"/>
           <w:sz w:val="24"/>
         </w:rPr>
-        <w:t>. Zero calibration removes all of these offsets at once.</w:t>
+        <w:t>. Zeroing removes all of these offsets at once, but it is purely an offset correction: it does not verify the gain (sensitivity) of the system, that is, the proportionality between a true pressure change and the displayed value. If the gain is wrong, the waveform is scaled and the error persists after zeroing. Our first question is therefore whether, after correct zeroing, a residual gain (scale) error can remain.</w:t>
       </w:r>
     </w:p>
     <w:p>
@@ -433,7 +419,7 @@
           <w:i w:val="0"/>
           <w:sz w:val="24"/>
         </w:rPr>
-        <w:t>Zeroing, however, is purely an offset correction: it does not verify the gain (sensitivity) of the system, that is, the proportionality between a true pressure change and the displayed value. If the gain is wrong, the waveform is scaled and the error persists after zeroing. A second, frequency-dependent gain error arises from the dynamic response of the fluid-filled system: under- or over-damping distorts the pulsatile signal and therefore pulse pressure</w:t>
+        <w:t>A second, frequency-dependent gain error arises from the dynamic response of the fluid-filled system: under- or over-damping distorts the pulsatile signal and therefore pulse pressure</w:t>
       </w:r>
       <w:r>
         <w:rPr>
@@ -451,7 +437,7 @@
           <w:i w:val="0"/>
           <w:sz w:val="24"/>
         </w:rPr>
-        <w:t>.</w:t>
+        <w:t>. This pulsatile gain error also survives zeroing and, unlike a static scale error, varies with heart rate; our second question is how it behaves and how it should be checked at the bedside.</w:t>
       </w:r>
     </w:p>
     <w:p>
@@ -465,57 +451,7 @@
           <w:i w:val="0"/>
           <w:sz w:val="24"/>
         </w:rPr>
-        <w:t>Zeroing nevertheless remains indispensable at the bedside, because these offsets are installation- and time-dependent physics rather than a factory-fixable device defect. The hydrostatic column depends on the height of the transducer relative to the phlebostatic axis (about 7.5 mmHg per 10 cm) and changes whenever the patient or the transducer is repositioned</w:t>
-      </w:r>
-      <w:r>
-        <w:rPr>
-          <w:rFonts w:ascii="Times New Roman" w:hAnsi="Times New Roman"/>
-          <w:b w:val="0"/>
-          <w:i w:val="0"/>
-          <w:sz w:val="24"/>
-        </w:rPr>
-        <w:t>[3]</w:t>
-      </w:r>
-      <w:r>
-        <w:rPr>
-          <w:rFonts w:ascii="Times New Roman" w:hAnsi="Times New Roman"/>
-          <w:b w:val="0"/>
-          <w:i w:val="0"/>
-          <w:sz w:val="24"/>
-        </w:rPr>
-        <w:t>; the atmospheric gauge reference drifts with weather and altitude; and electrical or thermal drift accumulates over time</w:t>
-      </w:r>
-      <w:r>
-        <w:rPr>
-          <w:rFonts w:ascii="Times New Roman" w:hAnsi="Times New Roman"/>
-          <w:b w:val="0"/>
-          <w:i w:val="0"/>
-          <w:sz w:val="24"/>
-        </w:rPr>
-        <w:t>[4–5]</w:t>
-      </w:r>
-      <w:r>
-        <w:rPr>
-          <w:rFonts w:ascii="Times New Roman" w:hAnsi="Times New Roman"/>
-          <w:b w:val="0"/>
-          <w:i w:val="0"/>
-          <w:sz w:val="24"/>
-        </w:rPr>
-        <w:t>. Detection is not the same as correction, and the two operate at different layers. Method-comparison analyses such as Bland–Altman regression are retrospective validation tools that require paired reference measurements, which are not available in real time for the patient in front of the clinician; zeroing is the only procedure that removes a known, setup-specific offset a priori and without a reference. Even when a regression reveals an offset, removing it still requires zeroing. Zeroing therefore corrects offset operationally, whereas regression and CCC decomposition detect residual gain and structure, and neither can substitute for the other.</w:t>
-      </w:r>
-    </w:p>
-    <w:p>
-      <w:pPr>
-        <w:spacing w:after="120"/>
-      </w:pPr>
-      <w:r>
-        <w:rPr>
-          <w:rFonts w:ascii="Times New Roman" w:hAnsi="Times New Roman"/>
-          <w:b w:val="0"/>
-          <w:i w:val="0"/>
-          <w:sz w:val="24"/>
-        </w:rPr>
-        <w:t xml:space="preserve">Validation studies for arterial pressure and derived haemodynamic monitors overwhelmingly report the Bland–Altman summary (mean bias and 95% limits of agreement) </w:t>
+        <w:t xml:space="preserve">How agreement is judged is the third issue. Validation studies for arterial pressure and derived haemodynamic monitors overwhelmingly report the Bland–Altman summary (mean bias and 95% limits of agreement) </w:t>
       </w:r>
       <w:r>
         <w:rPr>
@@ -551,7 +487,7 @@
           <w:i w:val="0"/>
           <w:sz w:val="24"/>
         </w:rPr>
-        <w:t xml:space="preserve">, with attention to the precision of the reference method </w:t>
+        <w:t>, with attention to the precision of the reference method</w:t>
       </w:r>
       <w:r>
         <w:rPr>
@@ -569,7 +505,7 @@
           <w:i w:val="0"/>
           <w:sz w:val="24"/>
         </w:rPr>
-        <w:t xml:space="preserve">. The original Bland–Altman method also includes regression of the differences on the mean to detect proportional bias </w:t>
+        <w:t xml:space="preserve">. In practice clinicians and manufacturers often read this minimal summary as a complete statement of agreement. Yet the original Bland–Altman method also includes regression of the differences on the mean to detect proportional bias </w:t>
       </w:r>
       <w:r>
         <w:rPr>
@@ -587,21 +523,7 @@
           <w:i w:val="0"/>
           <w:sz w:val="24"/>
         </w:rPr>
-        <w:t>, but this step is frequently omitted, and the mean-bias summary alone can be misleading when an offset and a gain error partially cancel.</w:t>
-      </w:r>
-    </w:p>
-    <w:p>
-      <w:pPr>
-        <w:spacing w:after="120"/>
-      </w:pPr>
-      <w:r>
-        <w:rPr>
-          <w:rFonts w:ascii="Times New Roman" w:hAnsi="Times New Roman"/>
-          <w:b w:val="0"/>
-          <w:i w:val="0"/>
-          <w:sz w:val="24"/>
-        </w:rPr>
-        <w:t xml:space="preserve">We do not claim that gain error is invisible to a properly conducted Bland–Altman analysis. Rather, using a reproducible simulation, we quantify which of the analyses actually reported in the literature detect a residual gain error after zeroing, and we position Lin’s concordance correlation coefficient (CCC) and its scale-shift component </w:t>
+        <w:t xml:space="preserve">, a step that is frequently omitted; when an offset and a gain error partially cancel, the mean-bias summary alone is misleading. Using a reproducible simulation, and without claiming that gain error is invisible to a properly conducted Bland–Altman analysis, we ask which analyses actually reported in the literature detect a residual gain error after zeroing, and we position Lin’s concordance correlation coefficient (CCC) and its scale-shift component </w:t>
       </w:r>
       <w:r>
         <w:rPr>
@@ -655,7 +577,7 @@
           <w:i w:val="0"/>
           <w:sz w:val="24"/>
         </w:rPr>
-        <w:t xml:space="preserve"> regression, as complementary diagnostics. We also integrate the dynamic-response (damping) error, which is specific to fluid-filled arterial lines, and discuss the range-dependence of the CCC </w:t>
+        <w:t xml:space="preserve"> regression, as complementary diagnostics, noting that the CCC depends on the sampled pressure range </w:t>
       </w:r>
       <w:r>
         <w:rPr>
@@ -674,6 +596,70 @@
           <w:sz w:val="24"/>
         </w:rPr>
         <w:t>.</w:t>
+      </w:r>
+    </w:p>
+    <w:p>
+      <w:pPr>
+        <w:spacing w:after="120"/>
+      </w:pPr>
+      <w:r>
+        <w:rPr>
+          <w:rFonts w:ascii="Times New Roman" w:hAnsi="Times New Roman"/>
+          <w:b w:val="0"/>
+          <w:i w:val="0"/>
+          <w:sz w:val="24"/>
+        </w:rPr>
+        <w:t>These choices matter beyond the individual study. Regulatory evaluation of a new monitor rests on the same method-comparison statistics, so if the reported summary cannot separate offset-corrected agreement from genuine gain accuracy, the approval decision inherits that blind spot. We therefore use the simulation to define a compact reporting framework, a proportional-bias–aware slope, the CCC decomposition and the sampled pressure range, together with an explicit dynamic-response check, that is meant to be usable both in validation papers and in device-approval review.</w:t>
+      </w:r>
+    </w:p>
+    <w:p>
+      <w:pPr>
+        <w:spacing w:after="120"/>
+      </w:pPr>
+      <w:r>
+        <w:rPr>
+          <w:rFonts w:ascii="Times New Roman" w:hAnsi="Times New Roman"/>
+          <w:b w:val="0"/>
+          <w:i w:val="0"/>
+          <w:sz w:val="24"/>
+        </w:rPr>
+        <w:t>Zeroing nevertheless remains indispensable at the bedside, because these offsets are installation- and time-dependent physics rather than a factory-fixable device defect. The hydrostatic column depends on the height of the transducer relative to the phlebostatic axis (about 7.5 mmHg per 10 cm) and changes whenever the patient or the transducer is repositioned</w:t>
+      </w:r>
+      <w:r>
+        <w:rPr>
+          <w:rFonts w:ascii="Times New Roman" w:hAnsi="Times New Roman"/>
+          <w:b w:val="0"/>
+          <w:i w:val="0"/>
+          <w:sz w:val="24"/>
+        </w:rPr>
+        <w:t>[3]</w:t>
+      </w:r>
+      <w:r>
+        <w:rPr>
+          <w:rFonts w:ascii="Times New Roman" w:hAnsi="Times New Roman"/>
+          <w:b w:val="0"/>
+          <w:i w:val="0"/>
+          <w:sz w:val="24"/>
+        </w:rPr>
+        <w:t>; the atmospheric gauge reference drifts with weather and altitude; and electrical or thermal drift accumulates over time</w:t>
+      </w:r>
+      <w:r>
+        <w:rPr>
+          <w:rFonts w:ascii="Times New Roman" w:hAnsi="Times New Roman"/>
+          <w:b w:val="0"/>
+          <w:i w:val="0"/>
+          <w:sz w:val="24"/>
+        </w:rPr>
+        <w:t>[4–5]</w:t>
+      </w:r>
+      <w:r>
+        <w:rPr>
+          <w:rFonts w:ascii="Times New Roman" w:hAnsi="Times New Roman"/>
+          <w:b w:val="0"/>
+          <w:i w:val="0"/>
+          <w:sz w:val="24"/>
+        </w:rPr>
+        <w:t>. Detection is not the same as correction, and the two operate at different layers: method-comparison analyses are retrospective and need paired reference measurements that are not available in real time, whereas zeroing removes a known, setup-specific offset a priori and without a reference. This also indicates the design horizon, because if the offset sources are engineered out of the hardware the need to zero disappears, leaving gain and dynamic response as the residual design and validation targets, the same quantities our framework isolates.</w:t>
       </w:r>
     </w:p>
     <w:p>
@@ -1641,7 +1627,63 @@
           <w:i w:val="0"/>
           <w:sz w:val="24"/>
         </w:rPr>
-        <w:t>Zero calibration corrects offset but not gain. A mean-bias–plus–limits-of-agreement summary can miss a residual gain error when an offset masks it, whereas Bland–Altman regression, Deming and Passing–Bablok regression, and the CCC scale shift detect it. Dynamic-response error is a distinct, frequency-dependent gain error diagnosed by the fast-flush test. We recommend that arterial pressure validation studies report a proportional-bias–aware analysis, the CCC decomposition with the sampled range, and an explicit dynamic-response check.</w:t>
+        <w:t>Zero calibration corrects offset but not gain, and a residual scale error can persist after perfect zeroing.</w:t>
+      </w:r>
+    </w:p>
+    <w:p>
+      <w:pPr>
+        <w:spacing w:after="120"/>
+      </w:pPr>
+      <w:r>
+        <w:rPr>
+          <w:rFonts w:ascii="Times New Roman" w:hAnsi="Times New Roman"/>
+          <w:b w:val="0"/>
+          <w:i w:val="0"/>
+          <w:sz w:val="24"/>
+        </w:rPr>
+        <w:t>Dynamic-response error is a distinct, frequency-dependent gain error that also survives zeroing and is diagnosed at the bedside by the fast-flush test.</w:t>
+      </w:r>
+    </w:p>
+    <w:p>
+      <w:pPr>
+        <w:spacing w:after="120"/>
+      </w:pPr>
+      <w:r>
+        <w:rPr>
+          <w:rFonts w:ascii="Times New Roman" w:hAnsi="Times New Roman"/>
+          <w:b w:val="0"/>
+          <w:i w:val="0"/>
+          <w:sz w:val="24"/>
+        </w:rPr>
+        <w:t>Read on its own, a mean-bias–plus–limits-of-agreement summary can miss such a gain error when an offset masks it, whereas Bland–Altman regression, Deming and Passing–Bablok regression, and the CCC scale shift all detect it. The message for clinicians and manufacturers is not to abandon Bland–Altman but to use it with its regression step and these complementary analyses.</w:t>
+      </w:r>
+    </w:p>
+    <w:p>
+      <w:pPr>
+        <w:spacing w:after="120"/>
+      </w:pPr>
+      <w:r>
+        <w:rPr>
+          <w:rFonts w:ascii="Times New Roman" w:hAnsi="Times New Roman"/>
+          <w:b w:val="0"/>
+          <w:i w:val="0"/>
+          <w:sz w:val="24"/>
+        </w:rPr>
+        <w:t>We recommend that arterial pressure validation studies, and device-approval evaluations, report a proportional-bias–aware analysis, the CCC decomposition with the sampled pressure range, and an explicit dynamic-response check, so that offset-corrected agreement is not mistaken for gain accuracy.</w:t>
+      </w:r>
+    </w:p>
+    <w:p>
+      <w:pPr>
+        <w:spacing w:after="120"/>
+      </w:pPr>
+      <w:r>
+        <w:rPr>
+          <w:rFonts w:ascii="Times New Roman" w:hAnsi="Times New Roman"/>
+          <w:b w:val="0"/>
+          <w:i w:val="0"/>
+          <w:sz w:val="24"/>
+        </w:rPr>
+        <w:t>Because zeroing addresses only the operational offset, designing the offset sources out of the hardware would make zeroing unnecessary and leave gain and dynamic response as the residual targets; expressing the remaining systematic error as the scale shift v gives a concrete design goal (v ≈ 1 without calibration) for the next generation of self-calibrating arterial pressure sensors.</w:t>
       </w:r>
     </w:p>
     <w:p>

</xml_diff>